<commit_message>
Use official emblem with transparent background
Co-Authored-By: Claude Sonnet 5.5 <noreply@anthropic.com>
Claude-Session: https://claude.ai/code/session_01LiP2Bk3vS7S9o452mjf9k5
</commit_message>
<xml_diff>
--- a/extension_request.docx
+++ b/extension_request.docx
@@ -99,7 +99,7 @@
             <w:r>
               <w:drawing>
                 <wp:inline distT="0" distB="0" distL="0" distR="0">
-                  <wp:extent cx="800100" cy="933450"/>
+                  <wp:extent cx="828675" cy="952500"/>
                   <wp:effectExtent t="0" r="0" b="0" l="0"/>
                   <wp:docPr id="1" name="emblem" descr="شعار شرطة عمان السلطانية" title="شعار"/>
                   <wp:cNvGraphicFramePr>
@@ -124,7 +124,7 @@
                         <pic:spPr bwMode="auto">
                           <a:xfrm>
                             <a:off x="0" y="0"/>
-                            <a:ext cx="800100" cy="933450"/>
+                            <a:ext cx="828675" cy="952500"/>
                           </a:xfrm>
                           <a:prstGeom prst="rect">
                             <a:avLst/>

</xml_diff>